<commit_message>
Fix maiden name anonymization (roz. Surname without parentheses)
The maiden name regex only matched "(roz. Surname)" with parentheses,
but documents also contain ", roz. Surname" without them. Updated
pattern to handle both cases. Re-anonymized smlouva14-17.

https://claude.ai/code/session_01AHreXaEBjpb7TVB5WdrzSy
</commit_message>
<xml_diff>
--- a/smlouva14_anon.docx
+++ b/smlouva14_anon.docx
@@ -230,7 +230,7 @@
     </w:p>
     <w:p>
       <w:r>
-        <w:t>Manželka: Ing. [[PERSON_3]], roz. Nováková</w:t>
+        <w:t>Manželka: Ing. [[PERSON_4]], roz. [[PERSON_3]]</w:t>
       </w:r>
     </w:p>
     <w:p>
@@ -251,12 +251,12 @@
     </w:p>
     <w:p>
       <w:r>
-        <w:t>1) [[PERSON_4]], [[DATE_3]], [[BIRTH_ID_3]]</w:t>
-      </w:r>
-    </w:p>
-    <w:p>
-      <w:r>
-        <w:t>2) [[PERSON_5]], [[DATE_4]], [[BIRTH_ID_4]]</w:t>
+        <w:t>1) [[PERSON_5]], [[DATE_3]], [[BIRTH_ID_3]]</w:t>
+      </w:r>
+    </w:p>
+    <w:p>
+      <w:r>
+        <w:t>2) [[PERSON_6]], [[DATE_4]], [[BIRTH_ID_4]]</w:t>
       </w:r>
     </w:p>
     <w:p/>
@@ -267,7 +267,7 @@
     </w:p>
     <w:p>
       <w:r>
-        <w:t>Matka: [[PERSON_6]], roz. Dvořáková</w:t>
+        <w:t>Matka: [[PERSON_8]], roz. [[PERSON_7]]</w:t>
       </w:r>
     </w:p>
     <w:p>
@@ -315,7 +315,7 @@
     </w:p>
     <w:p>
       <w:r>
-        <w:t>1.3. Přímý nadřízený: Ing. [[PERSON_7]], Ph.D., Team Lead</w:t>
+        <w:t>1.3. Přímý nadřízený: Ing. [[PERSON_9]], Ph.D., Team Lead</w:t>
       </w:r>
     </w:p>
     <w:p>
@@ -478,7 +478,7 @@
     </w:p>
     <w:p>
       <w:r>
-        <w:t xml:space="preserve">     Lékař: MUDr. [[PERSON_8]], praktický lékař</w:t>
+        <w:t xml:space="preserve">     Lékař: MUDr. [[PERSON_10]], praktický lékař</w:t>
       </w:r>
     </w:p>
     <w:p>
@@ -642,7 +642,7 @@
     </w:p>
     <w:p>
       <w:r>
-        <w:t xml:space="preserve">     Kontaktní osoba: Ing. [[PERSON_9]], CTO</w:t>
+        <w:t xml:space="preserve">     Kontaktní osoba: Ing. [[PERSON_11]], CTO</w:t>
       </w:r>
     </w:p>
     <w:p>
@@ -662,7 +662,7 @@
     </w:p>
     <w:p>
       <w:r>
-        <w:t xml:space="preserve">     Výpis z reference: "[PERSON_10]] jako Senior Developer 3 roky,</w:t>
+        <w:t xml:space="preserve">     Výpis z reference: "[PERSON_12]] jako Senior Developer 3 roky,</w:t>
       </w:r>
     </w:p>
     <w:p>
@@ -880,12 +880,12 @@
     </w:p>
     <w:p>
       <w:r>
-        <w:t xml:space="preserve">     - Bc. [[PERSON_11]] (HR Specialist), [[BIRTH_ID_8]]</w:t>
-      </w:r>
-    </w:p>
-    <w:p>
-      <w:r>
-        <w:t xml:space="preserve">     - Ing. [[PERSON_12]] (Payroll Manager), [[BIRTH_ID_9]]</w:t>
+        <w:t xml:space="preserve">     - Bc. [[PERSON_13]] (HR Specialist), [[BIRTH_ID_8]]</w:t>
+      </w:r>
+    </w:p>
+    <w:p>
+      <w:r>
+        <w:t xml:space="preserve">     - Ing. [[PERSON_14]] (Payroll Manager), [[BIRTH_ID_9]]</w:t>
       </w:r>
     </w:p>
     <w:p/>
@@ -1064,7 +1064,7 @@
     </w:p>
     <w:p>
       <w:r>
-        <w:t>Zastoupen: Mgr. [[PERSON_13]], ředitel pobočky Praha</w:t>
+        <w:t>Zastoupen: Mgr. [[PERSON_15]], ředitel pobočky Praha</w:t>
       </w:r>
     </w:p>
     <w:p>
@@ -1090,7 +1090,7 @@
     </w:p>
     <w:p>
       <w:r>
-        <w:t>MUDr. [[PERSON_14]]</w:t>
+        <w:t>MUDr. [[PERSON_16]]</w:t>
       </w:r>
     </w:p>
     <w:p>
@@ -1151,7 +1151,7 @@
     </w:p>
     <w:p>
       <w:r>
-        <w:t>Manžel: Ing. [[PERSON_15]]</w:t>
+        <w:t>Manžel: Ing. [[PERSON_17]]</w:t>
       </w:r>
     </w:p>
     <w:p>
@@ -1182,12 +1182,12 @@
     </w:p>
     <w:p>
       <w:r>
-        <w:t>1) [[PERSON_16]], [[DATE_7]], [[BIRTH_ID_12]]</w:t>
-      </w:r>
-    </w:p>
-    <w:p>
-      <w:r>
-        <w:t>2) [[PERSON_17]], [[DATE_8]], [[BIRTH_ID_13]]</w:t>
+        <w:t>1) [[PERSON_18]], [[DATE_7]], [[BIRTH_ID_12]]</w:t>
+      </w:r>
+    </w:p>
+    <w:p>
+      <w:r>
+        <w:t>2) [[PERSON_19]], [[DATE_8]], [[BIRTH_ID_13]]</w:t>
       </w:r>
     </w:p>
     <w:p/>
@@ -1283,7 +1283,7 @@
     </w:p>
     <w:p>
       <w:r>
-        <w:t xml:space="preserve">           Operatér: MUDr. [[PERSON_18]], Ph.D.</w:t>
+        <w:t xml:space="preserve">           Operatér: MUDr. [[PERSON_20]], Ph.D.</w:t>
       </w:r>
     </w:p>
     <w:p>
@@ -1308,7 +1308,7 @@
     </w:p>
     <w:p>
       <w:r>
-        <w:t xml:space="preserve">           Ošetřující lékař: MUDr. [[PERSON_19]], endokrinolog</w:t>
+        <w:t xml:space="preserve">           Ošetřující lékař: MUDr. [[PERSON_21]], endokrinolog</w:t>
       </w:r>
     </w:p>
     <w:p>
@@ -1333,7 +1333,7 @@
     </w:p>
     <w:p>
       <w:r>
-        <w:t xml:space="preserve">           Psychiatr: MUDr. [[PERSON_8]], Ph.D.</w:t>
+        <w:t xml:space="preserve">           Psychiatr: MUDr. [[PERSON_10]], Ph.D.</w:t>
       </w:r>
     </w:p>
     <w:p>
@@ -1432,7 +1432,7 @@
     </w:p>
     <w:p>
       <w:r>
-        <w:t xml:space="preserve">      Gynekolog: MUDr. [[PERSON_20]]</w:t>
+        <w:t xml:space="preserve">      Gynekolog: MUDr. [[PERSON_22]]</w:t>
       </w:r>
     </w:p>
     <w:p>
@@ -1458,7 +1458,7 @@
     </w:p>
     <w:p>
       <w:r>
-        <w:t xml:space="preserve">      Praktický lékař: MUDr. [[PERSON_7]]</w:t>
+        <w:t xml:space="preserve">      Praktický lékař: MUDr. [[PERSON_9]]</w:t>
       </w:r>
     </w:p>
     <w:p>
@@ -1700,7 +1700,7 @@
     </w:p>
     <w:p>
       <w:r>
-        <w:t xml:space="preserve">     Ing. [[PERSON_15]] (manžel)</w:t>
+        <w:t xml:space="preserve">     Ing. [[PERSON_17]] (manžel)</w:t>
       </w:r>
     </w:p>
     <w:p>
@@ -1730,12 +1730,12 @@
     </w:p>
     <w:p>
       <w:r>
-        <w:t xml:space="preserve">     50%: [[PERSON_16]] (syn), [[BIRTH_ID_12]]</w:t>
-      </w:r>
-    </w:p>
-    <w:p>
-      <w:r>
-        <w:t xml:space="preserve">     50%: [[PERSON_17]] (dcera), [[BIRTH_ID_13]]</w:t>
+        <w:t xml:space="preserve">     50%: [[PERSON_18]] (syn), [[BIRTH_ID_12]]</w:t>
+      </w:r>
+    </w:p>
+    <w:p>
+      <w:r>
+        <w:t xml:space="preserve">     50%: [[PERSON_19]] (dcera), [[BIRTH_ID_13]]</w:t>
       </w:r>
     </w:p>
     <w:p>
@@ -1750,7 +1750,7 @@
     </w:p>
     <w:p>
       <w:r>
-        <w:t xml:space="preserve">     [[PERSON_21]] (sestra pojištěné)</w:t>
+        <w:t xml:space="preserve">     [[PERSON_23]] (sestra pojištěné)</w:t>
       </w:r>
     </w:p>
     <w:p>
@@ -1819,7 +1819,7 @@
     </w:p>
     <w:p>
       <w:r>
-        <w:t xml:space="preserve">     Majitel: MUDr. [[PERSON_14]], [[BIRTH_ID_10]]</w:t>
+        <w:t xml:space="preserve">     Majitel: MUDr. [[PERSON_16]], [[BIRTH_ID_10]]</w:t>
       </w:r>
     </w:p>
     <w:p/>
@@ -1866,7 +1866,7 @@
     </w:p>
     <w:p>
       <w:r>
-        <w:t xml:space="preserve">     Jméno na kartě: [[PERSON_14]]</w:t>
+        <w:t xml:space="preserve">     Jméno na kartě: [[PERSON_16]]</w:t>
       </w:r>
     </w:p>
     <w:p/>
@@ -2001,7 +2001,7 @@
     </w:p>
     <w:p>
       <w:r>
-        <w:t xml:space="preserve">     - MUDr. [[PERSON_7]] (praktický lékař)</w:t>
+        <w:t xml:space="preserve">     - MUDr. [[PERSON_9]] (praktický lékař)</w:t>
       </w:r>
     </w:p>
     <w:p>
@@ -2021,7 +2021,7 @@
     </w:p>
     <w:p>
       <w:r>
-        <w:t xml:space="preserve">     - MUDr. [[PERSON_19]] (endokrinolog)</w:t>
+        <w:t xml:space="preserve">     - MUDr. [[PERSON_21]] (endokrinolog)</w:t>
       </w:r>
     </w:p>
     <w:p>
@@ -2041,7 +2041,7 @@
     </w:p>
     <w:p>
       <w:r>
-        <w:t xml:space="preserve">     - MUDr. [[PERSON_20]] (gynekolog)</w:t>
+        <w:t xml:space="preserve">     - MUDr. [[PERSON_22]] (gynekolog)</w:t>
       </w:r>
     </w:p>
     <w:p>
@@ -2103,7 +2103,7 @@
     </w:p>
     <w:p>
       <w:r>
-        <w:t xml:space="preserve">     MUDr. Ing. [[PERSON_22]], Ph.D., MBA</w:t>
+        <w:t xml:space="preserve">     MUDr. Ing. [[PERSON_24]], Ph.D., MBA</w:t>
       </w:r>
     </w:p>
     <w:p>
@@ -2183,7 +2183,7 @@
     </w:p>
     <w:p>
       <w:r>
-        <w:t xml:space="preserve">     Operace: Osteosyntéza šroubem (MUDr. [[PERSON_23]], ortoped)</w:t>
+        <w:t xml:space="preserve">     Operace: Osteosyntéza šroubem (MUDr. [[PERSON_25]], ortoped)</w:t>
       </w:r>
     </w:p>
     <w:p>
@@ -2262,7 +2262,7 @@
     </w:p>
     <w:p>
       <w:r>
-        <w:t>Mgr. [[PERSON_13]]                          MUDr. [[PERSON_14]]</w:t>
+        <w:t>Mgr. [[PERSON_15]]                          MUDr. [[PERSON_16]]</w:t>
       </w:r>
     </w:p>
     <w:p>
@@ -2342,7 +2342,7 @@
     </w:p>
     <w:p>
       <w:r>
-        <w:t>Zastoupen: MUDr. Bc. [[PERSON_24]], MBA, jednatel a ředitel</w:t>
+        <w:t>Zastoupen: MUDr. Bc. [[PERSON_26]], MBA, jednatel a ředitel</w:t>
       </w:r>
     </w:p>
     <w:p>
@@ -2398,7 +2398,7 @@
     </w:p>
     <w:p>
       <w:r>
-        <w:t>Zastoupen: Ing. [[PERSON_11]], Ph.D., generální ředitelka</w:t>
+        <w:t>Zastoupen: Ing. [[PERSON_13]], Ph.D., generální ředitelka</w:t>
       </w:r>
     </w:p>
     <w:p>
@@ -2521,7 +2521,7 @@
     </w:p>
     <w:p>
       <w:r>
-        <w:t xml:space="preserve">     Jméno: Ing. [[PERSON_25]]</w:t>
+        <w:t xml:space="preserve">     Jméno: Ing. [[PERSON_27]]</w:t>
       </w:r>
     </w:p>
     <w:p>
@@ -2592,12 +2592,12 @@
     </w:p>
     <w:p>
       <w:r>
-        <w:t xml:space="preserve">     - MUDr. [[PERSON_19]] (internista), [[BIRTH_ID_22]], č. lékaře: 23456</w:t>
-      </w:r>
-    </w:p>
-    <w:p>
-      <w:r>
-        <w:t xml:space="preserve">     - MUDr. [[PERSON_8]] (diabetolog), [[BIRTH_ID_23]], č. lékaře: 34567</w:t>
+        <w:t xml:space="preserve">     - MUDr. [[PERSON_21]] (internista), [[BIRTH_ID_22]], č. lékaře: 23456</w:t>
+      </w:r>
+    </w:p>
+    <w:p>
+      <w:r>
+        <w:t xml:space="preserve">     - MUDr. [[PERSON_10]] (diabetolog), [[BIRTH_ID_23]], č. lékaře: 34567</w:t>
       </w:r>
     </w:p>
     <w:p>
@@ -2677,7 +2677,7 @@
     </w:p>
     <w:p>
       <w:r>
-        <w:t xml:space="preserve">     Jméno: Bc. [[PERSON_26]]</w:t>
+        <w:t xml:space="preserve">     Jméno: Bc. [[PERSON_28]]</w:t>
       </w:r>
     </w:p>
     <w:p>
@@ -2743,7 +2743,7 @@
     </w:p>
     <w:p>
       <w:r>
-        <w:t xml:space="preserve">     Psychiatr: MUDr. [[PERSON_27]], Ph.D.</w:t>
+        <w:t xml:space="preserve">     Psychiatr: MUDr. [[PERSON_29]], Ph.D.</w:t>
       </w:r>
     </w:p>
     <w:p>
@@ -2798,7 +2798,7 @@
     </w:p>
     <w:p>
       <w:r>
-        <w:t xml:space="preserve">     Psychoterapeut: Mgr. [[PERSON_12]], Ph.D.</w:t>
+        <w:t xml:space="preserve">     Psychoterapeut: Mgr. [[PERSON_14]], Ph.D.</w:t>
       </w:r>
     </w:p>
     <w:p>
@@ -2858,7 +2858,7 @@
     </w:p>
     <w:p>
       <w:r>
-        <w:t xml:space="preserve">     Jméno: JUDr. [[PERSON_28]]</w:t>
+        <w:t xml:space="preserve">     Jméno: JUDr. [[PERSON_30]]</w:t>
       </w:r>
     </w:p>
     <w:p>
@@ -2923,7 +2923,7 @@
     </w:p>
     <w:p>
       <w:r>
-        <w:t xml:space="preserve">     Onkolog: MUDr. Ing. [[PERSON_7]], CSc.</w:t>
+        <w:t xml:space="preserve">     Onkolog: MUDr. Ing. [[PERSON_9]], CSc.</w:t>
       </w:r>
     </w:p>
     <w:p>
@@ -2953,7 +2953,7 @@
     </w:p>
     <w:p>
       <w:r>
-        <w:t xml:space="preserve">     - Operatér: MUDr. [[PERSON_9]], Ph.D. (urolog)</w:t>
+        <w:t xml:space="preserve">     - Operatér: MUDr. [[PERSON_11]], Ph.D. (urolog)</w:t>
       </w:r>
     </w:p>
     <w:p>
@@ -3043,12 +3043,12 @@
     </w:p>
     <w:p>
       <w:r>
-        <w:t xml:space="preserve">     1) [[PERSON_15]], nar. 1995, [[BIRTH_ID_29]]</w:t>
-      </w:r>
-    </w:p>
-    <w:p>
-      <w:r>
-        <w:t xml:space="preserve">     2) [[PERSON_29]], nar. 1998, [[BIRTH_ID_30]]</w:t>
+        <w:t xml:space="preserve">     1) [[PERSON_17]], nar. 1995, [[BIRTH_ID_29]]</w:t>
+      </w:r>
+    </w:p>
+    <w:p>
+      <w:r>
+        <w:t xml:space="preserve">     2) [[PERSON_31]], nar. 1998, [[BIRTH_ID_30]]</w:t>
       </w:r>
     </w:p>
     <w:p/>
@@ -3074,7 +3074,7 @@
     </w:p>
     <w:p>
       <w:r>
-        <w:t xml:space="preserve">     1) MUDr. [[PERSON_24]] (majitel, jednatel)</w:t>
+        <w:t xml:space="preserve">     1) MUDr. [[PERSON_26]] (majitel, jednatel)</w:t>
       </w:r>
     </w:p>
     <w:p>
@@ -3104,7 +3104,7 @@
     </w:p>
     <w:p>
       <w:r>
-        <w:t xml:space="preserve">     2) MUDr. [[PERSON_6]] (zástupkyně)</w:t>
+        <w:t xml:space="preserve">     2) MUDr. [[PERSON_8]] (zástupkyně)</w:t>
       </w:r>
     </w:p>
     <w:p>
@@ -3129,7 +3129,7 @@
     </w:p>
     <w:p>
       <w:r>
-        <w:t xml:space="preserve">     3) Bc. [[PERSON_11]] (zdravotní sestra)</w:t>
+        <w:t xml:space="preserve">     3) Bc. [[PERSON_13]] (zdravotní sestra)</w:t>
       </w:r>
     </w:p>
     <w:p>
@@ -3154,7 +3154,7 @@
     </w:p>
     <w:p>
       <w:r>
-        <w:t xml:space="preserve">     4) Ing. [[PERSON_30]] (IT administrátor)</w:t>
+        <w:t xml:space="preserve">     4) Ing. [[PERSON_32]] (IT administrátor)</w:t>
       </w:r>
     </w:p>
     <w:p>
@@ -3184,7 +3184,7 @@
     </w:p>
     <w:p>
       <w:r>
-        <w:t xml:space="preserve">     5) Bc. [[PERSON_8]] (účetní)</w:t>
+        <w:t xml:space="preserve">     5) Bc. [[PERSON_10]] (účetní)</w:t>
       </w:r>
     </w:p>
     <w:p>
@@ -3651,7 +3651,7 @@
     </w:p>
     <w:p>
       <w:r>
-        <w:t xml:space="preserve">     1) Ing. [[PERSON_31]] (Cloud Architect)</w:t>
+        <w:t xml:space="preserve">     1) Ing. [[PERSON_33]] (Cloud Architect)</w:t>
       </w:r>
     </w:p>
     <w:p>
@@ -3676,7 +3676,7 @@
     </w:p>
     <w:p>
       <w:r>
-        <w:t xml:space="preserve">     2) Bc. [[PERSON_32]] (DBA)</w:t>
+        <w:t xml:space="preserve">     2) Bc. [[PERSON_34]] (DBA)</w:t>
       </w:r>
     </w:p>
     <w:p>
@@ -3701,7 +3701,7 @@
     </w:p>
     <w:p>
       <w:r>
-        <w:t xml:space="preserve">     3) Ing. [[PERSON_33]], Ph.D. (Security Officer)</w:t>
+        <w:t xml:space="preserve">     3) Ing. [[PERSON_35]], Ph.D. (Security Officer)</w:t>
       </w:r>
     </w:p>
     <w:p>
@@ -3726,7 +3726,7 @@
     </w:p>
     <w:p>
       <w:r>
-        <w:t xml:space="preserve">     4) Mgr. [[PERSON_8]] (GDPR Officer)</w:t>
+        <w:t xml:space="preserve">     4) Mgr. [[PERSON_10]] (GDPR Officer)</w:t>
       </w:r>
     </w:p>
     <w:p>
@@ -3861,7 +3861,7 @@
     </w:p>
     <w:p>
       <w:r>
-        <w:t xml:space="preserve">        Osoba odpovědná: Ing. [[PERSON_34]], [[BIRTH_ID_39]]</w:t>
+        <w:t xml:space="preserve">        Osoba odpovědná: Ing. [[PERSON_36]], [[BIRTH_ID_39]]</w:t>
       </w:r>
     </w:p>
     <w:p>
@@ -3896,7 +3896,7 @@
     </w:p>
     <w:p>
       <w:r>
-        <w:t xml:space="preserve">        Osoba odpovědná: Bc. [[PERSON_35]], [[BIRTH_ID_40]]</w:t>
+        <w:t xml:space="preserve">        Osoba odpovědná: Bc. [[PERSON_37]], [[BIRTH_ID_40]]</w:t>
       </w:r>
     </w:p>
     <w:p>
@@ -4165,7 +4165,7 @@
     </w:p>
     <w:p>
       <w:r>
-        <w:t>MUDr. Bc. [[PERSON_24]], MBA                Ing. [[PERSON_11]], Ph.D.</w:t>
+        <w:t>MUDr. Bc. [[PERSON_26]], MBA                Ing. [[PERSON_13]], Ph.D.</w:t>
       </w:r>
     </w:p>
     <w:p>
@@ -4246,7 +4246,7 @@
     </w:p>
     <w:p>
       <w:r>
-        <w:t>Zastoupena: Mgr. Ing. [[PERSON_26]], MBA, ředitelka obchodního centra Brno</w:t>
+        <w:t>Zastoupena: Mgr. Ing. [[PERSON_28]], MBA, ředitelka obchodního centra Brno</w:t>
       </w:r>
     </w:p>
     <w:p>
@@ -4272,7 +4272,7 @@
     </w:p>
     <w:p>
       <w:r>
-        <w:t>Mgr. [[PERSON_36]]</w:t>
+        <w:t>Mgr. [[PERSON_38]]</w:t>
       </w:r>
     </w:p>
     <w:p>
@@ -4338,7 +4338,7 @@
     </w:p>
     <w:p>
       <w:r>
-        <w:t>Manželka: Bc. [[PERSON_37]], roz. Horáková</w:t>
+        <w:t>Manželka: Bc. [[PERSON_40]], roz. [[PERSON_39]]</w:t>
       </w:r>
     </w:p>
     <w:p>
@@ -4364,7 +4364,7 @@
     </w:p>
     <w:p>
       <w:r>
-        <w:t>Ing. [[PERSON_38]] (otec dlužníka)</w:t>
+        <w:t>Ing. [[PERSON_41]] (otec dlužníka)</w:t>
       </w:r>
     </w:p>
     <w:p>
@@ -4410,7 +4410,7 @@
     </w:p>
     <w:p>
       <w:r>
-        <w:t>Mgr. [[PERSON_39]] (švagr dlužníka)</w:t>
+        <w:t>Mgr. [[PERSON_42]] (švagr dlužníka)</w:t>
       </w:r>
     </w:p>
     <w:p>
@@ -4566,7 +4566,7 @@
     </w:p>
     <w:p>
       <w:r>
-        <w:t xml:space="preserve">     Potvrzeno: Ing. [[PERSON_26]], HR Manager AutoTech s.r.o.</w:t>
+        <w:t xml:space="preserve">     Potvrzeno: Ing. [[PERSON_28]], HR Manager AutoTech s.r.o.</w:t>
       </w:r>
     </w:p>
     <w:p>
@@ -4947,7 +4947,7 @@
     <w:p/>
     <w:p>
       <w:r>
-        <w:t>3.3. MAJETEK RUČITELE 1 ([[PERSON_40]], otec):</w:t>
+        <w:t>3.3. MAJETEK RUČITELE 1 ([[PERSON_43]], otec):</w:t>
       </w:r>
     </w:p>
     <w:p>
@@ -5008,7 +5008,7 @@
     <w:p/>
     <w:p>
       <w:r>
-        <w:t>3.4. MAJETEK RUČITELE 2 ([[PERSON_39]], švagr):</w:t>
+        <w:t>3.4. MAJETEK RUČITELE 2 ([[PERSON_42]], švagr):</w:t>
       </w:r>
     </w:p>
     <w:p>
@@ -5149,7 +5149,7 @@
     <w:p/>
     <w:p>
       <w:r>
-        <w:t>4.3. CREDIT SCORING RUČITELE 1 ([[PERSON_40]]):</w:t>
+        <w:t>4.3. CREDIT SCORING RUČITELE 1 ([[PERSON_43]]):</w:t>
       </w:r>
     </w:p>
     <w:p>
@@ -5170,7 +5170,7 @@
     <w:p/>
     <w:p>
       <w:r>
-        <w:t>4.4. CREDIT SCORING RUČITELE 2 ([[PERSON_39]]):</w:t>
+        <w:t>4.4. CREDIT SCORING RUČITELE 2 ([[PERSON_42]]):</w:t>
       </w:r>
     </w:p>
     <w:p>
@@ -5208,7 +5208,7 @@
     </w:p>
     <w:p>
       <w:r>
-        <w:t xml:space="preserve">     Pojistník: Mgr. [[PERSON_36]]</w:t>
+        <w:t xml:space="preserve">     Pojistník: Mgr. [[PERSON_38]]</w:t>
       </w:r>
     </w:p>
     <w:p>
@@ -5280,7 +5280,7 @@
     </w:p>
     <w:p>
       <w:r>
-        <w:t xml:space="preserve">     Ručitel 1: Ing. [[PERSON_40]], [[BIRTH_ID_43]]</w:t>
+        <w:t xml:space="preserve">     Ručitel 1: Ing. [[PERSON_43]], [[BIRTH_ID_43]]</w:t>
       </w:r>
     </w:p>
     <w:p>
@@ -5300,7 +5300,7 @@
     </w:p>
     <w:p>
       <w:r>
-        <w:t xml:space="preserve">     Ručitel 2: Mgr. [[PERSON_39]], [[BIRTH_ID_44]]</w:t>
+        <w:t xml:space="preserve">     Ručitel 2: Mgr. [[PERSON_42]], [[BIRTH_ID_44]]</w:t>
       </w:r>
     </w:p>
     <w:p>
@@ -5380,7 +5380,7 @@
     </w:p>
     <w:p>
       <w:r>
-        <w:t xml:space="preserve">     Majitel: Mgr. [[PERSON_36]], [[BIRTH_ID_41]]</w:t>
+        <w:t xml:space="preserve">     Majitel: Mgr. [[PERSON_38]], [[BIRTH_ID_41]]</w:t>
       </w:r>
     </w:p>
     <w:p/>
@@ -5471,7 +5471,7 @@
     </w:p>
     <w:p>
       <w:r>
-        <w:t xml:space="preserve">     Mgr. [[PERSON_41]], Data Protection Officer</w:t>
+        <w:t xml:space="preserve">     Mgr. [[PERSON_44]], Data Protection Officer</w:t>
       </w:r>
     </w:p>
     <w:p>
@@ -5505,7 +5505,7 @@
     <w:p/>
     <w:p>
       <w:r>
-        <w:t>1) Mgr. Ing. [[PERSON_26]], MBA (ředitelka obchodního centra)</w:t>
+        <w:t>1) Mgr. Ing. [[PERSON_28]], MBA (ředitelka obchodního centra)</w:t>
       </w:r>
     </w:p>
     <w:p>
@@ -5521,7 +5521,7 @@
     <w:p/>
     <w:p>
       <w:r>
-        <w:t>2) Bc. [[PERSON_31]] (úvěrový specialista)</w:t>
+        <w:t>2) Bc. [[PERSON_33]] (úvěrový specialista)</w:t>
       </w:r>
     </w:p>
     <w:p>
@@ -5537,7 +5537,7 @@
     <w:p/>
     <w:p>
       <w:r>
-        <w:t>3) Ing. [[PERSON_21]] (risk manager)</w:t>
+        <w:t>3) Ing. [[PERSON_23]] (risk manager)</w:t>
       </w:r>
     </w:p>
     <w:p>
@@ -5553,7 +5553,7 @@
     <w:p/>
     <w:p>
       <w:r>
-        <w:t>4) Bc. [[PERSON_35]] (back office)</w:t>
+        <w:t>4) Bc. [[PERSON_37]] (back office)</w:t>
       </w:r>
     </w:p>
     <w:p>
@@ -5592,7 +5592,7 @@
     </w:p>
     <w:p>
       <w:r>
-        <w:t>Mgr. Ing. [[PERSON_26]], MBA</w:t>
+        <w:t>Mgr. Ing. [[PERSON_28]], MBA</w:t>
       </w:r>
     </w:p>
     <w:p>
@@ -5618,7 +5618,7 @@
     </w:p>
     <w:p>
       <w:r>
-        <w:t>Mgr. [[PERSON_36]]                         Bc. [[PERSON_37]]</w:t>
+        <w:t>Mgr. [[PERSON_38]]                         Bc. [[PERSON_40]]</w:t>
       </w:r>
     </w:p>
     <w:p>
@@ -5639,7 +5639,7 @@
     </w:p>
     <w:p>
       <w:r>
-        <w:t>Ing. [[PERSON_40]]                           Mgr. [[PERSON_39]]</w:t>
+        <w:t>Ing. [[PERSON_43]]                           Mgr. [[PERSON_42]]</w:t>
       </w:r>
     </w:p>
     <w:p>
@@ -5724,7 +5724,7 @@
     </w:p>
     <w:p>
       <w:r>
-        <w:t>Zastoupena: Ing. Mgr. [[PERSON_24]], Ph.D., CEO</w:t>
+        <w:t>Zastoupena: Ing. Mgr. [[PERSON_26]], Ph.D., CEO</w:t>
       </w:r>
     </w:p>
     <w:p>
@@ -5775,7 +5775,7 @@
     </w:p>
     <w:p>
       <w:r>
-        <w:t>Zastoupena: Ing. [[PERSON_7]], MBA, jednatel</w:t>
+        <w:t>Zastoupena: Ing. [[PERSON_9]], MBA, jednatel</w:t>
       </w:r>
     </w:p>
     <w:p>
@@ -6003,7 +6003,7 @@
     </w:p>
     <w:p>
       <w:r>
-        <w:t xml:space="preserve">     Kontaktní osoba: MUDr. Ing. [[PERSON_19]], Ph.D., primář radiologie</w:t>
+        <w:t xml:space="preserve">     Kontaktní osoba: MUDr. Ing. [[PERSON_21]], Ph.D., primář radiologie</w:t>
       </w:r>
     </w:p>
     <w:p>
@@ -6119,7 +6119,7 @@
     </w:p>
     <w:p>
       <w:r>
-        <w:t xml:space="preserve">     Kontaktní osoba: Prof. MUDr. [[PERSON_21]], DrSc., ředitelka kardiologie</w:t>
+        <w:t xml:space="preserve">     Kontaktní osoba: Prof. MUDr. [[PERSON_23]], DrSc., ředitelka kardiologie</w:t>
       </w:r>
     </w:p>
     <w:p>
@@ -6225,7 +6225,7 @@
     </w:p>
     <w:p>
       <w:r>
-        <w:t xml:space="preserve">     Kontaktní osoba: MUDr. [[PERSON_42]], Ph.D., vedoucí oddělení</w:t>
+        <w:t xml:space="preserve">     Kontaktní osoba: MUDr. [[PERSON_45]], Ph.D., vedoucí oddělení</w:t>
       </w:r>
     </w:p>
     <w:p>
@@ -6403,7 +6403,7 @@
     </w:p>
     <w:p>
       <w:r>
-        <w:t xml:space="preserve">     1) Ing. Mgr. [[PERSON_24]], Ph.D. - CEO</w:t>
+        <w:t xml:space="preserve">     1) Ing. Mgr. [[PERSON_26]], Ph.D. - CEO</w:t>
       </w:r>
     </w:p>
     <w:p>
@@ -6438,7 +6438,7 @@
     </w:p>
     <w:p>
       <w:r>
-        <w:t xml:space="preserve">     2) Ing. [[PERSON_32]], Ph.D. - CTO</w:t>
+        <w:t xml:space="preserve">     2) Ing. [[PERSON_34]], Ph.D. - CTO</w:t>
       </w:r>
     </w:p>
     <w:p>
@@ -6493,7 +6493,7 @@
     </w:p>
     <w:p>
       <w:r>
-        <w:t xml:space="preserve">     3) MUDr. Ing. [[PERSON_43]], Ph.D. - Chief Medical Officer</w:t>
+        <w:t xml:space="preserve">     3) MUDr. Ing. [[PERSON_46]], Ph.D. - Chief Medical Officer</w:t>
       </w:r>
     </w:p>
     <w:p>
@@ -6549,7 +6549,7 @@
     </w:p>
     <w:p>
       <w:r>
-        <w:t xml:space="preserve">     4) Bc. [[PERSON_44]] - Lead ML Engineer</w:t>
+        <w:t xml:space="preserve">     4) Bc. [[PERSON_47]] - Lead ML Engineer</w:t>
       </w:r>
     </w:p>
     <w:p>
@@ -6589,7 +6589,7 @@
     </w:p>
     <w:p>
       <w:r>
-        <w:t xml:space="preserve">     5) Ing. [[PERSON_45]] - Head of Sales</w:t>
+        <w:t xml:space="preserve">     5) Ing. [[PERSON_48]] - Head of Sales</w:t>
       </w:r>
     </w:p>
     <w:p>
@@ -6640,12 +6640,12 @@
     </w:p>
     <w:p>
       <w:r>
-        <w:t xml:space="preserve">     - Ing. [[PERSON_24]] (CEO): 45%</w:t>
-      </w:r>
-    </w:p>
-    <w:p>
-      <w:r>
-        <w:t xml:space="preserve">     - Ing. [[PERSON_32]] (CTO): 25%</w:t>
+        <w:t xml:space="preserve">     - Ing. [[PERSON_26]] (CEO): 45%</w:t>
+      </w:r>
+    </w:p>
+    <w:p>
+      <w:r>
+        <w:t xml:space="preserve">     - Ing. [[PERSON_34]] (CTO): 25%</w:t>
       </w:r>
     </w:p>
     <w:p>
@@ -6655,7 +6655,7 @@
     </w:p>
     <w:p>
       <w:r>
-        <w:t xml:space="preserve">       Kontakt: Mgr. [[PERSON_13]], partner</w:t>
+        <w:t xml:space="preserve">       Kontakt: Mgr. [[PERSON_15]], partner</w:t>
       </w:r>
     </w:p>
     <w:p>
@@ -6680,7 +6680,7 @@
     </w:p>
     <w:p>
       <w:r>
-        <w:t xml:space="preserve">       Kontakt: [[PERSON_46]], managing partner</w:t>
+        <w:t xml:space="preserve">       Kontakt: [[PERSON_49]], managing partner</w:t>
       </w:r>
     </w:p>
     <w:p>
@@ -6736,7 +6736,7 @@
     </w:p>
     <w:p>
       <w:r>
-        <w:t xml:space="preserve">     Vynálezci: [[PERSON_32]], [[PERSON_44]]</w:t>
+        <w:t xml:space="preserve">     Vynálezci: [[PERSON_34]], [[PERSON_47]]</w:t>
       </w:r>
     </w:p>
     <w:p>
@@ -6766,7 +6766,7 @@
     </w:p>
     <w:p>
       <w:r>
-        <w:t xml:space="preserve">     Vynálezci: [[PERSON_24]], [[PERSON_47]]</w:t>
+        <w:t xml:space="preserve">     Vynálezci: [[PERSON_26]], [[PERSON_50]]</w:t>
       </w:r>
     </w:p>
     <w:p>
@@ -6833,7 +6833,7 @@
     </w:p>
     <w:p>
       <w:r>
-        <w:t xml:space="preserve">        Key person: Ing. [[PERSON_48]], CEO</w:t>
+        <w:t xml:space="preserve">        Key person: Ing. [[PERSON_51]], CEO</w:t>
       </w:r>
     </w:p>
     <w:p>
@@ -6868,7 +6868,7 @@
     </w:p>
     <w:p>
       <w:r>
-        <w:t xml:space="preserve">        Key person: Dr. [[PERSON_49]], CEO</w:t>
+        <w:t xml:space="preserve">        Key person: Dr. [[PERSON_52]], CEO</w:t>
       </w:r>
     </w:p>
     <w:p>
@@ -7159,7 +7159,7 @@
     </w:p>
     <w:p>
       <w:r>
-        <w:t xml:space="preserve">     1) Ing. [[PERSON_7]] (jednatel)</w:t>
+        <w:t xml:space="preserve">     1) Ing. [[PERSON_9]] (jednatel)</w:t>
       </w:r>
     </w:p>
     <w:p>
@@ -7184,7 +7184,7 @@
     </w:p>
     <w:p>
       <w:r>
-        <w:t xml:space="preserve">     2) Ing. [[PERSON_50]] (CTO)</w:t>
+        <w:t xml:space="preserve">     2) Ing. [[PERSON_53]] (CTO)</w:t>
       </w:r>
     </w:p>
     <w:p>
@@ -7209,7 +7209,7 @@
     </w:p>
     <w:p>
       <w:r>
-        <w:t xml:space="preserve">     3) Mgr. [[PERSON_49]] (Legal counsel)</w:t>
+        <w:t xml:space="preserve">     3) Mgr. [[PERSON_52]] (Legal counsel)</w:t>
       </w:r>
     </w:p>
     <w:p>
@@ -7447,7 +7447,7 @@
     </w:p>
     <w:p>
       <w:r>
-        <w:t>Ing. Mgr. [[PERSON_24]], Ph.D.             Ing. [[PERSON_7]], MBA</w:t>
+        <w:t>Ing. Mgr. [[PERSON_26]], Ph.D.             Ing. [[PERSON_9]], MBA</w:t>
       </w:r>
     </w:p>
     <w:p>

</xml_diff>